<commit_message>
fix: parameterize repeated original contract seller and payment fields
</commit_message>
<xml_diff>
--- a/backend/templates/review/rs-dejvice-original-review.docx
+++ b/backend/templates/review/rs-dejvice-original-review.docx
@@ -3783,14 +3783,14 @@
           <w:rFonts w:ascii="Arial" w:hAnsi="Arial" w:cs="Arial"/>
           <w:sz w:val="20"/>
         </w:rPr>
-        <w:t>, vedený u UniCredit Bank</w:t>
-      </w:r>
-      <w:r>
-        <w:rPr>
-          <w:rFonts w:ascii="Arial" w:hAnsi="Arial" w:cs="Arial"/>
-          <w:sz w:val="20"/>
-        </w:rPr>
-        <w:t xml:space="preserve"> Czech Republic and Slovakia a.s.</w:t>
+        <w:t>, vedený u {{seller.bankName}}</w:t>
+      </w:r>
+      <w:r>
+        <w:rPr>
+          <w:rFonts w:ascii="Arial" w:hAnsi="Arial" w:cs="Arial"/>
+          <w:sz w:val="20"/>
+        </w:rPr>
+        <w:t xml:space="preserve"/>
       </w:r>
       <w:r>
         <w:rPr>

</xml_diff>